<commit_message>
Update diario W22 - 2026-05-25
</commit_message>
<xml_diff>
--- a/diario-cybersecurity-2026.docx
+++ b/diario-cybersecurity-2026.docx
@@ -111,6 +111,22 @@
       <w:pPr>
         <w:spacing w:after="60" w:before="120"/>
       </w:pPr>
+      <w:hyperlink w:history="1" w:anchor="bm_w21_24mag">
+        <w:r>
+          <w:rPr>
+            <w:rStyle w:val="Hyperlink"/>
+            <w:rFonts w:ascii="Calibri" w:cs="Calibri" w:eastAsia="Calibri" w:hAnsi="Calibri"/>
+            <w:sz w:val="22"/>
+            <w:szCs w:val="22"/>
+          </w:rPr>
+          <w:t xml:space="preserve">W21 · 24 maggio 2026 — Idira (PANW) · Sysdig Sage CNAPP · Akamai Guardicore Platform</w:t>
+        </w:r>
+      </w:hyperlink>
+    </w:p>
+    <w:p>
+      <w:pPr>
+        <w:spacing w:after="60" w:before="120"/>
+      </w:pPr>
       <w:hyperlink w:history="1" w:anchor="bm_w21">
         <w:r>
           <w:rPr>
@@ -122,6 +138,907 @@
           <w:t xml:space="preserve">W21 · 21 maggio 2026 — Idira (PANW) · Sysdig Headless Cloud Security · Dragos Platform 3.1</w:t>
         </w:r>
       </w:hyperlink>
+    </w:p>
+    <w:p>
+      <w:r>
+        <w:br w:type="page"/>
+      </w:r>
+    </w:p>
+    <w:p>
+      <w:pPr>
+        <w:pStyle w:val="Heading1"/>
+      </w:pPr>
+      <w:bookmarkStart w:name="bm_w21_24mag" w:id="50"/>
+      <w:r>
+        <w:rPr>
+          <w:rFonts w:ascii="Calibri" w:cs="Calibri" w:eastAsia="Calibri" w:hAnsi="Calibri"/>
+          <w:b/>
+          <w:bCs/>
+          <w:color w:val="1F4E79"/>
+          <w:sz w:val="28"/>
+          <w:szCs w:val="28"/>
+        </w:rPr>
+        <w:t xml:space="preserve">W21 · 24 maggio 2026</w:t>
+      </w:r>
+      <w:bookmarkEnd w:id="50"/>
+    </w:p>
+    <w:tbl>
+      <w:tblPr>
+        <w:tblW w:type="dxa" w:w="9026"/>
+        <w:tblBorders>
+          <w:top w:val="single" w:color="auto" w:sz="4"/>
+          <w:left w:val="single" w:color="auto" w:sz="4"/>
+          <w:bottom w:val="single" w:color="auto" w:sz="4"/>
+          <w:right w:val="single" w:color="auto" w:sz="4"/>
+          <w:insideH w:val="single" w:color="auto" w:sz="4"/>
+          <w:insideV w:val="single" w:color="auto" w:sz="4"/>
+        </w:tblBorders>
+      </w:tblPr>
+      <w:tblGrid>
+        <w:gridCol w:w="2252"/>
+        <w:gridCol w:w="2252"/>
+        <w:gridCol w:w="2251"/>
+        <w:gridCol w:w="2271"/>
+      </w:tblGrid>
+      <w:tr>
+        <w:tc>
+          <w:tcPr>
+            <w:tcW w:type="dxa" w:w="2252"/>
+            <w:tcBorders>
+              <w:top w:val="single" w:color="C9C9C9" w:sz="1"/>
+              <w:left w:val="single" w:color="C9C9C9" w:sz="1"/>
+              <w:bottom w:val="single" w:color="C9C9C9" w:sz="1"/>
+              <w:right w:val="single" w:color="C9C9C9" w:sz="1"/>
+            </w:tcBorders>
+            <w:shd w:fill="DEEAF1" w:val="clear"/>
+            <w:tcMar>
+              <w:top w:type="dxa" w:w="80"/>
+              <w:left w:type="dxa" w:w="120"/>
+              <w:bottom w:type="dxa" w:w="80"/>
+              <w:right w:type="dxa" w:w="120"/>
+            </w:tcMar>
+          </w:tcPr>
+          <w:p>
+            <w:pPr>
+              <w:spacing w:after="20" w:before="0"/>
+            </w:pPr>
+            <w:r>
+              <w:rPr>
+                <w:rFonts w:ascii="Calibri" w:cs="Calibri" w:eastAsia="Calibri" w:hAnsi="Calibri"/>
+                <w:b/>
+                <w:bCs/>
+                <w:color w:val="1F4E79"/>
+                <w:sz w:val="18"/>
+                <w:szCs w:val="18"/>
+              </w:rPr>
+              <w:t>Data</w:t>
+            </w:r>
+          </w:p>
+          <w:p>
+            <w:pPr>
+              <w:spacing w:after="0" w:before="0"/>
+            </w:pPr>
+            <w:r>
+              <w:rPr>
+                <w:rFonts w:ascii="Calibri" w:cs="Calibri" w:eastAsia="Calibri" w:hAnsi="Calibri"/>
+                <w:sz w:val="22"/>
+                <w:szCs w:val="22"/>
+              </w:rPr>
+              <w:t>24 maggio 2026</w:t>
+            </w:r>
+          </w:p>
+        </w:tc>
+        <w:tc>
+          <w:tcPr>
+            <w:tcW w:type="dxa" w:w="2252"/>
+            <w:tcBorders>
+              <w:top w:val="single" w:color="C9C9C9" w:sz="1"/>
+              <w:left w:val="single" w:color="C9C9C9" w:sz="1"/>
+              <w:bottom w:val="single" w:color="C9C9C9" w:sz="1"/>
+              <w:right w:val="single" w:color="C9C9C9" w:sz="1"/>
+            </w:tcBorders>
+            <w:shd w:fill="DEEAF1" w:val="clear"/>
+            <w:tcMar>
+              <w:top w:type="dxa" w:w="80"/>
+              <w:left w:type="dxa" w:w="120"/>
+              <w:bottom w:type="dxa" w:w="80"/>
+              <w:right w:type="dxa" w:w="120"/>
+            </w:tcMar>
+          </w:tcPr>
+          <w:p>
+            <w:pPr>
+              <w:spacing w:after="20" w:before="0"/>
+            </w:pPr>
+            <w:r>
+              <w:rPr>
+                <w:rFonts w:ascii="Calibri" w:cs="Calibri" w:eastAsia="Calibri" w:hAnsi="Calibri"/>
+                <w:b/>
+                <w:bCs/>
+                <w:color w:val="1F4E79"/>
+                <w:sz w:val="18"/>
+                <w:szCs w:val="18"/>
+              </w:rPr>
+              <w:t>Settimana ISO</w:t>
+            </w:r>
+          </w:p>
+          <w:p>
+            <w:pPr>
+              <w:spacing w:after="0" w:before="0"/>
+            </w:pPr>
+            <w:r>
+              <w:rPr>
+                <w:rFonts w:ascii="Calibri" w:cs="Calibri" w:eastAsia="Calibri" w:hAnsi="Calibri"/>
+                <w:sz w:val="22"/>
+                <w:szCs w:val="22"/>
+              </w:rPr>
+              <w:t>W21 / 2026</w:t>
+            </w:r>
+          </w:p>
+        </w:tc>
+        <w:tc>
+          <w:tcPr>
+            <w:tcW w:type="dxa" w:w="2251"/>
+            <w:tcBorders>
+              <w:top w:val="single" w:color="C9C9C9" w:sz="1"/>
+              <w:left w:val="single" w:color="C9C9C9" w:sz="1"/>
+              <w:bottom w:val="single" w:color="C9C9C9" w:sz="1"/>
+              <w:right w:val="single" w:color="C9C9C9" w:sz="1"/>
+            </w:tcBorders>
+            <w:shd w:fill="DEEAF1" w:val="clear"/>
+            <w:tcMar>
+              <w:top w:type="dxa" w:w="80"/>
+              <w:left w:type="dxa" w:w="120"/>
+              <w:bottom w:type="dxa" w:w="80"/>
+              <w:right w:type="dxa" w:w="120"/>
+            </w:tcMar>
+          </w:tcPr>
+          <w:p>
+            <w:pPr>
+              <w:spacing w:after="20" w:before="0"/>
+            </w:pPr>
+            <w:r>
+              <w:rPr>
+                <w:rFonts w:ascii="Calibri" w:cs="Calibri" w:eastAsia="Calibri" w:hAnsi="Calibri"/>
+                <w:b/>
+                <w:bCs/>
+                <w:color w:val="1F4E79"/>
+                <w:sz w:val="18"/>
+                <w:szCs w:val="18"/>
+              </w:rPr>
+              <w:t>Ambiti</w:t>
+            </w:r>
+          </w:p>
+          <w:p>
+            <w:pPr>
+              <w:spacing w:after="0" w:before="0"/>
+            </w:pPr>
+            <w:r>
+              <w:rPr>
+                <w:rFonts w:ascii="Calibri" w:cs="Calibri" w:eastAsia="Calibri" w:hAnsi="Calibri"/>
+                <w:sz w:val="22"/>
+                <w:szCs w:val="22"/>
+              </w:rPr>
+              <w:t>5 su 5</w:t>
+            </w:r>
+          </w:p>
+        </w:tc>
+        <w:tc>
+          <w:tcPr>
+            <w:tcW w:type="dxa" w:w="2271"/>
+            <w:tcBorders>
+              <w:top w:val="single" w:color="C9C9C9" w:sz="1"/>
+              <w:left w:val="single" w:color="C9C9C9" w:sz="1"/>
+              <w:bottom w:val="single" w:color="C9C9C9" w:sz="1"/>
+              <w:right w:val="single" w:color="C9C9C9" w:sz="1"/>
+            </w:tcBorders>
+            <w:shd w:fill="DEEAF1" w:val="clear"/>
+            <w:tcMar>
+              <w:top w:type="dxa" w:w="80"/>
+              <w:left w:type="dxa" w:w="120"/>
+              <w:bottom w:type="dxa" w:w="80"/>
+              <w:right w:type="dxa" w:w="120"/>
+            </w:tcMar>
+          </w:tcPr>
+          <w:p>
+            <w:pPr>
+              <w:spacing w:after="20" w:before="0"/>
+            </w:pPr>
+            <w:r>
+              <w:rPr>
+                <w:rFonts w:ascii="Calibri" w:cs="Calibri" w:eastAsia="Calibri" w:hAnsi="Calibri"/>
+                <w:b/>
+                <w:bCs/>
+                <w:color w:val="1F4E79"/>
+                <w:sz w:val="18"/>
+                <w:szCs w:val="18"/>
+              </w:rPr>
+              <w:t>Target</w:t>
+            </w:r>
+          </w:p>
+          <w:p>
+            <w:pPr>
+              <w:spacing w:after="0" w:before="0"/>
+            </w:pPr>
+            <w:r>
+              <w:rPr>
+                <w:rFonts w:ascii="Calibri" w:cs="Calibri" w:eastAsia="Calibri" w:hAnsi="Calibri"/>
+                <w:sz w:val="22"/>
+                <w:szCs w:val="22"/>
+              </w:rPr>
+              <w:t xml:space="preserve">Enterprise, Mid-market &amp; PA Centrale</w:t>
+            </w:r>
+          </w:p>
+        </w:tc>
+      </w:tr>
+    </w:tbl>
+    <w:p>
+      <w:pPr>
+        <w:spacing w:after="60" w:before="240"/>
+      </w:pPr>
+    </w:p>
+    <w:p>
+      <w:pPr>
+        <w:pStyle w:val="Heading2"/>
+      </w:pPr>
+      <w:r>
+        <w:rPr>
+          <w:rFonts w:ascii="Calibri" w:cs="Calibri" w:eastAsia="Calibri" w:hAnsi="Calibri"/>
+          <w:b/>
+          <w:bCs/>
+          <w:color w:val="4472C4"/>
+          <w:sz w:val="24"/>
+          <w:szCs w:val="24"/>
+        </w:rPr>
+        <w:t>Le 3 soluzioni della settimana</w:t>
+      </w:r>
+    </w:p>
+    <w:tbl>
+      <w:tblPr>
+        <w:tblW w:type="dxa" w:w="9026"/>
+        <w:tblBorders>
+          <w:top w:val="single" w:color="auto" w:sz="4"/>
+          <w:left w:val="single" w:color="auto" w:sz="4"/>
+          <w:bottom w:val="single" w:color="auto" w:sz="4"/>
+          <w:right w:val="single" w:color="auto" w:sz="4"/>
+          <w:insideH w:val="single" w:color="auto" w:sz="4"/>
+          <w:insideV w:val="single" w:color="auto" w:sz="4"/>
+        </w:tblBorders>
+      </w:tblPr>
+      <w:tblGrid>
+        <w:gridCol w:w="2000"/>
+        <w:gridCol w:w="7026"/>
+      </w:tblGrid>
+      <w:tr>
+        <w:tc>
+          <w:tcPr>
+            <w:gridSpan w:val="2"/>
+            <w:tcBorders>
+              <w:top w:val="single" w:color="C9C9C9" w:sz="1"/>
+              <w:left w:val="single" w:color="C9C9C9" w:sz="1"/>
+              <w:bottom w:val="single" w:color="C9C9C9" w:sz="1"/>
+              <w:right w:val="single" w:color="C9C9C9" w:sz="1"/>
+            </w:tcBorders>
+            <w:shd w:fill="1F4E79" w:val="clear"/>
+            <w:tcMar>
+              <w:top w:type="dxa" w:w="100"/>
+              <w:left w:type="dxa" w:w="160"/>
+              <w:bottom w:type="dxa" w:w="100"/>
+              <w:right w:type="dxa" w:w="160"/>
+            </w:tcMar>
+          </w:tcPr>
+          <w:p>
+            <w:r>
+              <w:rPr>
+                <w:rFonts w:ascii="Calibri" w:cs="Calibri" w:eastAsia="Calibri" w:hAnsi="Calibri"/>
+                <w:b/>
+                <w:bCs/>
+                <w:color w:val="FFFFFF"/>
+                <w:sz w:val="26"/>
+                <w:szCs w:val="26"/>
+              </w:rPr>
+              <w:t xml:space="preserve">1. Palo Alto Networks — Idira</w:t>
+            </w:r>
+            <w:r>
+              <w:rPr>
+                <w:rFonts w:ascii="Calibri" w:cs="Calibri" w:eastAsia="Calibri" w:hAnsi="Calibri"/>
+                <w:color w:val="BDD7EE"/>
+                <w:sz w:val="20"/>
+                <w:szCs w:val="20"/>
+              </w:rPr>
+              <w:t xml:space="preserve">  ·  Internazionale (USA)</w:t>
+            </w:r>
+          </w:p>
+        </w:tc>
+      </w:tr>
+      <w:tr>
+        <w:tc>
+          <w:tcPr>
+            <w:gridSpan w:val="2"/>
+            <w:tcBorders>
+              <w:top w:val="single" w:color="C9C9C9" w:sz="1"/>
+              <w:left w:val="single" w:color="C9C9C9" w:sz="1"/>
+              <w:bottom w:val="single" w:color="C9C9C9" w:sz="1"/>
+              <w:right w:val="single" w:color="C9C9C9" w:sz="1"/>
+            </w:tcBorders>
+            <w:shd w:fill="DEEAF1" w:val="clear"/>
+            <w:tcMar>
+              <w:top w:type="dxa" w:w="60"/>
+              <w:left w:type="dxa" w:w="160"/>
+              <w:bottom w:type="dxa" w:w="60"/>
+              <w:right w:type="dxa" w:w="160"/>
+            </w:tcMar>
+          </w:tcPr>
+          <w:p>
+            <w:r>
+              <w:rPr>
+                <w:rFonts w:ascii="Calibri" w:cs="Calibri" w:eastAsia="Calibri" w:hAnsi="Calibri"/>
+                <w:b/>
+                <w:bCs/>
+                <w:color w:val="1F4E79"/>
+                <w:sz w:val="22"/>
+                <w:szCs w:val="22"/>
+              </w:rPr>
+              <w:t xml:space="preserve">Ambito: </w:t>
+            </w:r>
+            <w:r>
+              <w:rPr>
+                <w:rFonts w:ascii="Calibri" w:cs="Calibri" w:eastAsia="Calibri" w:hAnsi="Calibri"/>
+                <w:i/>
+                <w:iCs/>
+                <w:sz w:val="22"/>
+                <w:szCs w:val="22"/>
+              </w:rPr>
+              <w:t>Endpoint &amp; Identity (PAM, ITDR, Zero Trust)</w:t>
+            </w:r>
+          </w:p>
+        </w:tc>
+      </w:tr>
+      <w:tr>
+        <w:tc>
+          <w:tcPr>
+            <w:tcW w:type="dxa" w:w="2000"/>
+            <w:tcBorders>
+              <w:top w:val="single" w:color="C9C9C9" w:sz="1"/>
+              <w:left w:val="single" w:color="C9C9C9" w:sz="1"/>
+              <w:bottom w:val="single" w:color="C9C9C9" w:sz="1"/>
+              <w:right w:val="single" w:color="C9C9C9" w:sz="1"/>
+            </w:tcBorders>
+            <w:shd w:fill="2E75B6" w:val="clear"/>
+            <w:tcMar>
+              <w:top w:type="dxa" w:w="80"/>
+              <w:left w:type="dxa" w:w="160"/>
+              <w:bottom w:type="dxa" w:w="80"/>
+              <w:right w:type="dxa" w:w="160"/>
+            </w:tcMar>
+          </w:tcPr>
+          <w:p>
+            <w:r>
+              <w:rPr>
+                <w:rFonts w:ascii="Calibri" w:cs="Calibri" w:eastAsia="Calibri" w:hAnsi="Calibri"/>
+                <w:b/>
+                <w:bCs/>
+                <w:color w:val="FFFFFF"/>
+                <w:sz w:val="20"/>
+                <w:szCs w:val="20"/>
+              </w:rPr>
+              <w:t>Cosa fa</w:t>
+            </w:r>
+          </w:p>
+        </w:tc>
+        <w:tc>
+          <w:tcPr>
+            <w:tcW w:type="dxa" w:w="7026"/>
+            <w:tcBorders>
+              <w:top w:val="single" w:color="C9C9C9" w:sz="1"/>
+              <w:left w:val="single" w:color="C9C9C9" w:sz="1"/>
+              <w:bottom w:val="single" w:color="C9C9C9" w:sz="1"/>
+              <w:right w:val="single" w:color="C9C9C9" w:sz="1"/>
+            </w:tcBorders>
+            <w:tcMar>
+              <w:top w:type="dxa" w:w="80"/>
+              <w:left w:type="dxa" w:w="160"/>
+              <w:bottom w:type="dxa" w:w="80"/>
+              <w:right w:type="dxa" w:w="160"/>
+            </w:tcMar>
+          </w:tcPr>
+          <w:p>
+            <w:r>
+              <w:rPr>
+                <w:rFonts w:ascii="Calibri" w:cs="Calibri" w:eastAsia="Calibri" w:hAnsi="Calibri"/>
+                <w:sz w:val="22"/>
+                <w:szCs w:val="22"/>
+              </w:rPr>
+              <w:t xml:space="preserve">Piattaforma PAM di nuova generazione lanciata il 12 maggio 2026. Unifica gestione degli accessi privilegiati (PAM) con ITDR per ogni tipo di identità: umana, macchina e agente AI. Basata sulla tecnologia CyberArk (acquisita per $25 miliardi), la estende all’ecosistema AI agente.</w:t>
+            </w:r>
+          </w:p>
+        </w:tc>
+      </w:tr>
+      <w:tr>
+        <w:tc>
+          <w:tcPr>
+            <w:tcW w:type="dxa" w:w="2000"/>
+            <w:tcBorders>
+              <w:top w:val="single" w:color="C9C9C9" w:sz="1"/>
+              <w:left w:val="single" w:color="C9C9C9" w:sz="1"/>
+              <w:bottom w:val="single" w:color="C9C9C9" w:sz="1"/>
+              <w:right w:val="single" w:color="C9C9C9" w:sz="1"/>
+            </w:tcBorders>
+            <w:shd w:fill="2E75B6" w:val="clear"/>
+            <w:tcMar>
+              <w:top w:type="dxa" w:w="80"/>
+              <w:left w:type="dxa" w:w="160"/>
+              <w:bottom w:type="dxa" w:w="80"/>
+              <w:right w:type="dxa" w:w="160"/>
+            </w:tcMar>
+          </w:tcPr>
+          <w:p>
+            <w:r>
+              <w:rPr>
+                <w:rFonts w:ascii="Calibri" w:cs="Calibri" w:eastAsia="Calibri" w:hAnsi="Calibri"/>
+                <w:b/>
+                <w:bCs/>
+                <w:color w:val="FFFFFF"/>
+                <w:sz w:val="20"/>
+                <w:szCs w:val="20"/>
+              </w:rPr>
+              <w:t>Perché ora</w:t>
+            </w:r>
+          </w:p>
+        </w:tc>
+        <w:tc>
+          <w:tcPr>
+            <w:tcW w:type="dxa" w:w="7026"/>
+            <w:tcBorders>
+              <w:top w:val="single" w:color="C9C9C9" w:sz="1"/>
+              <w:left w:val="single" w:color="C9C9C9" w:sz="1"/>
+              <w:bottom w:val="single" w:color="C9C9C9" w:sz="1"/>
+              <w:right w:val="single" w:color="C9C9C9" w:sz="1"/>
+            </w:tcBorders>
+            <w:tcMar>
+              <w:top w:type="dxa" w:w="80"/>
+              <w:left w:type="dxa" w:w="160"/>
+              <w:bottom w:type="dxa" w:w="80"/>
+              <w:right w:type="dxa" w:w="160"/>
+            </w:tcMar>
+          </w:tcPr>
+          <w:p>
+            <w:r>
+              <w:rPr>
+                <w:rFonts w:ascii="Calibri" w:cs="Calibri" w:eastAsia="Calibri" w:hAnsi="Calibri"/>
+                <w:sz w:val="22"/>
+                <w:szCs w:val="22"/>
+              </w:rPr>
+              <w:t xml:space="preserve">NIS2 e PSNC richiedono controlli PAM rigorosi per infrastrutture critiche. Idira colma il gap sulle identità agentiche, nuovo vettore di attacco nell’era AI. Rilevante per PA Centrale con qualificazione ACN Cloud.</w:t>
+            </w:r>
+          </w:p>
+        </w:tc>
+      </w:tr>
+      <w:tr>
+        <w:tc>
+          <w:tcPr>
+            <w:gridSpan w:val="2"/>
+            <w:tcBorders>
+              <w:top w:val="single" w:color="C9C9C9" w:sz="1"/>
+              <w:left w:val="single" w:color="C9C9C9" w:sz="1"/>
+              <w:bottom w:val="single" w:color="C9C9C9" w:sz="1"/>
+              <w:right w:val="single" w:color="C9C9C9" w:sz="1"/>
+            </w:tcBorders>
+            <w:shd w:fill="1F4E79" w:val="clear"/>
+            <w:tcMar>
+              <w:top w:type="dxa" w:w="100"/>
+              <w:left w:type="dxa" w:w="160"/>
+              <w:bottom w:type="dxa" w:w="100"/>
+              <w:right w:type="dxa" w:w="160"/>
+            </w:tcMar>
+          </w:tcPr>
+          <w:p>
+            <w:r>
+              <w:rPr>
+                <w:rFonts w:ascii="Calibri" w:cs="Calibri" w:eastAsia="Calibri" w:hAnsi="Calibri"/>
+                <w:b/>
+                <w:bCs/>
+                <w:color w:val="FFFFFF"/>
+                <w:sz w:val="26"/>
+                <w:szCs w:val="26"/>
+              </w:rPr>
+              <w:t xml:space="preserve">2. Sysdig — CNAPP con Sysdig Sage</w:t>
+            </w:r>
+            <w:r>
+              <w:rPr>
+                <w:rFonts w:ascii="Calibri" w:cs="Calibri" w:eastAsia="Calibri" w:hAnsi="Calibri"/>
+                <w:color w:val="BDD7EE"/>
+                <w:sz w:val="20"/>
+                <w:szCs w:val="20"/>
+              </w:rPr>
+              <w:t xml:space="preserve">  ·  Internazionale (USA)</w:t>
+            </w:r>
+          </w:p>
+        </w:tc>
+      </w:tr>
+      <w:tr>
+        <w:tc>
+          <w:tcPr>
+            <w:gridSpan w:val="2"/>
+            <w:tcBorders>
+              <w:top w:val="single" w:color="C9C9C9" w:sz="1"/>
+              <w:left w:val="single" w:color="C9C9C9" w:sz="1"/>
+              <w:bottom w:val="single" w:color="C9C9C9" w:sz="1"/>
+              <w:right w:val="single" w:color="C9C9C9" w:sz="1"/>
+            </w:tcBorders>
+            <w:shd w:fill="DEEAF1" w:val="clear"/>
+            <w:tcMar>
+              <w:top w:type="dxa" w:w="60"/>
+              <w:left w:type="dxa" w:w="160"/>
+              <w:bottom w:type="dxa" w:w="60"/>
+              <w:right w:type="dxa" w:w="160"/>
+            </w:tcMar>
+          </w:tcPr>
+          <w:p>
+            <w:r>
+              <w:rPr>
+                <w:rFonts w:ascii="Calibri" w:cs="Calibri" w:eastAsia="Calibri" w:hAnsi="Calibri"/>
+                <w:b/>
+                <w:bCs/>
+                <w:color w:val="1F4E79"/>
+                <w:sz w:val="22"/>
+                <w:szCs w:val="22"/>
+              </w:rPr>
+              <w:t xml:space="preserve">Ambito: </w:t>
+            </w:r>
+            <w:r>
+              <w:rPr>
+                <w:rFonts w:ascii="Calibri" w:cs="Calibri" w:eastAsia="Calibri" w:hAnsi="Calibri"/>
+                <w:i/>
+                <w:iCs/>
+                <w:sz w:val="22"/>
+                <w:szCs w:val="22"/>
+              </w:rPr>
+              <w:t>Cloud &amp; Infrastructure Security (CNAPP, CSPM, CWPP)</w:t>
+            </w:r>
+          </w:p>
+        </w:tc>
+      </w:tr>
+      <w:tr>
+        <w:tc>
+          <w:tcPr>
+            <w:tcW w:type="dxa" w:w="2000"/>
+            <w:tcBorders>
+              <w:top w:val="single" w:color="C9C9C9" w:sz="1"/>
+              <w:left w:val="single" w:color="C9C9C9" w:sz="1"/>
+              <w:bottom w:val="single" w:color="C9C9C9" w:sz="1"/>
+              <w:right w:val="single" w:color="C9C9C9" w:sz="1"/>
+            </w:tcBorders>
+            <w:shd w:fill="2E75B6" w:val="clear"/>
+            <w:tcMar>
+              <w:top w:type="dxa" w:w="80"/>
+              <w:left w:type="dxa" w:w="160"/>
+              <w:bottom w:type="dxa" w:w="80"/>
+              <w:right w:type="dxa" w:w="160"/>
+            </w:tcMar>
+          </w:tcPr>
+          <w:p>
+            <w:r>
+              <w:rPr>
+                <w:rFonts w:ascii="Calibri" w:cs="Calibri" w:eastAsia="Calibri" w:hAnsi="Calibri"/>
+                <w:b/>
+                <w:bCs/>
+                <w:color w:val="FFFFFF"/>
+                <w:sz w:val="20"/>
+                <w:szCs w:val="20"/>
+              </w:rPr>
+              <w:t>Cosa fa</w:t>
+            </w:r>
+          </w:p>
+        </w:tc>
+        <w:tc>
+          <w:tcPr>
+            <w:tcW w:type="dxa" w:w="7026"/>
+            <w:tcBorders>
+              <w:top w:val="single" w:color="C9C9C9" w:sz="1"/>
+              <w:left w:val="single" w:color="C9C9C9" w:sz="1"/>
+              <w:bottom w:val="single" w:color="C9C9C9" w:sz="1"/>
+              <w:right w:val="single" w:color="C9C9C9" w:sz="1"/>
+            </w:tcBorders>
+            <w:tcMar>
+              <w:top w:type="dxa" w:w="80"/>
+              <w:left w:type="dxa" w:w="160"/>
+              <w:bottom w:type="dxa" w:w="80"/>
+              <w:right w:type="dxa" w:w="160"/>
+            </w:tcMar>
+          </w:tcPr>
+          <w:p>
+            <w:r>
+              <w:rPr>
+                <w:rFonts w:ascii="Calibri" w:cs="Calibri" w:eastAsia="Calibri" w:hAnsi="Calibri"/>
+                <w:sz w:val="22"/>
+                <w:szCs w:val="22"/>
+              </w:rPr>
+              <w:t xml:space="preserve">Leader Forrester Wave CNAPP Q1 2026. Piattaforma cloud-native unificata (CSPM, CWPP, CIEM, runtime) con Sysdig Sage: primo analista AI agente integrato che indaga alert autonomamente, riduce MTTR del 76% e risparmia 80h/settimana di triage manuale.</w:t>
+            </w:r>
+          </w:p>
+        </w:tc>
+      </w:tr>
+      <w:tr>
+        <w:tc>
+          <w:tcPr>
+            <w:tcW w:type="dxa" w:w="2000"/>
+            <w:tcBorders>
+              <w:top w:val="single" w:color="C9C9C9" w:sz="1"/>
+              <w:left w:val="single" w:color="C9C9C9" w:sz="1"/>
+              <w:bottom w:val="single" w:color="C9C9C9" w:sz="1"/>
+              <w:right w:val="single" w:color="C9C9C9" w:sz="1"/>
+            </w:tcBorders>
+            <w:shd w:fill="2E75B6" w:val="clear"/>
+            <w:tcMar>
+              <w:top w:type="dxa" w:w="80"/>
+              <w:left w:type="dxa" w:w="160"/>
+              <w:bottom w:type="dxa" w:w="80"/>
+              <w:right w:type="dxa" w:w="160"/>
+            </w:tcMar>
+          </w:tcPr>
+          <w:p>
+            <w:r>
+              <w:rPr>
+                <w:rFonts w:ascii="Calibri" w:cs="Calibri" w:eastAsia="Calibri" w:hAnsi="Calibri"/>
+                <w:b/>
+                <w:bCs/>
+                <w:color w:val="FFFFFF"/>
+                <w:sz w:val="20"/>
+                <w:szCs w:val="20"/>
+              </w:rPr>
+              <w:t>Perché ora</w:t>
+            </w:r>
+          </w:p>
+        </w:tc>
+        <w:tc>
+          <w:tcPr>
+            <w:tcW w:type="dxa" w:w="7026"/>
+            <w:tcBorders>
+              <w:top w:val="single" w:color="C9C9C9" w:sz="1"/>
+              <w:left w:val="single" w:color="C9C9C9" w:sz="1"/>
+              <w:bottom w:val="single" w:color="C9C9C9" w:sz="1"/>
+              <w:right w:val="single" w:color="C9C9C9" w:sz="1"/>
+            </w:tcBorders>
+            <w:tcMar>
+              <w:top w:type="dxa" w:w="80"/>
+              <w:left w:type="dxa" w:w="160"/>
+              <w:bottom w:type="dxa" w:w="80"/>
+              <w:right w:type="dxa" w:w="160"/>
+            </w:tcMar>
+          </w:tcPr>
+          <w:p>
+            <w:r>
+              <w:rPr>
+                <w:rFonts w:ascii="Calibri" w:cs="Calibri" w:eastAsia="Calibri" w:hAnsi="Calibri"/>
+                <w:sz w:val="22"/>
+                <w:szCs w:val="22"/>
+              </w:rPr>
+              <w:t xml:space="preserve">Headless Cloud Security: la security diventa nativa nel ciclo AI. Per PA Centrale con PSN e cloud ACN, soddisfa requisiti NIS2 (43 misure soggetti essenziali, scadenza ottobre 2026) con visibility continua e audit trail automatizzati.</w:t>
+            </w:r>
+          </w:p>
+        </w:tc>
+      </w:tr>
+      <w:tr>
+        <w:tc>
+          <w:tcPr>
+            <w:gridSpan w:val="2"/>
+            <w:tcBorders>
+              <w:top w:val="single" w:color="C9C9C9" w:sz="1"/>
+              <w:left w:val="single" w:color="C9C9C9" w:sz="1"/>
+              <w:bottom w:val="single" w:color="C9C9C9" w:sz="1"/>
+              <w:right w:val="single" w:color="C9C9C9" w:sz="1"/>
+            </w:tcBorders>
+            <w:shd w:fill="1F4E79" w:val="clear"/>
+            <w:tcMar>
+              <w:top w:type="dxa" w:w="100"/>
+              <w:left w:type="dxa" w:w="160"/>
+              <w:bottom w:type="dxa" w:w="100"/>
+              <w:right w:type="dxa" w:w="160"/>
+            </w:tcMar>
+          </w:tcPr>
+          <w:p>
+            <w:r>
+              <w:rPr>
+                <w:rFonts w:ascii="Calibri" w:cs="Calibri" w:eastAsia="Calibri" w:hAnsi="Calibri"/>
+                <w:b/>
+                <w:bCs/>
+                <w:color w:val="FFFFFF"/>
+                <w:sz w:val="26"/>
+                <w:szCs w:val="26"/>
+              </w:rPr>
+              <w:t xml:space="preserve">3. Akamai — Guardicore Platform</w:t>
+            </w:r>
+            <w:r>
+              <w:rPr>
+                <w:rFonts w:ascii="Calibri" w:cs="Calibri" w:eastAsia="Calibri" w:hAnsi="Calibri"/>
+                <w:color w:val="BDD7EE"/>
+                <w:sz w:val="20"/>
+                <w:szCs w:val="20"/>
+              </w:rPr>
+              <w:t xml:space="preserve">  ·  Internazionale (USA)</w:t>
+            </w:r>
+          </w:p>
+        </w:tc>
+      </w:tr>
+      <w:tr>
+        <w:tc>
+          <w:tcPr>
+            <w:gridSpan w:val="2"/>
+            <w:tcBorders>
+              <w:top w:val="single" w:color="C9C9C9" w:sz="1"/>
+              <w:left w:val="single" w:color="C9C9C9" w:sz="1"/>
+              <w:bottom w:val="single" w:color="C9C9C9" w:sz="1"/>
+              <w:right w:val="single" w:color="C9C9C9" w:sz="1"/>
+            </w:tcBorders>
+            <w:shd w:fill="DEEAF1" w:val="clear"/>
+            <w:tcMar>
+              <w:top w:type="dxa" w:w="60"/>
+              <w:left w:type="dxa" w:w="160"/>
+              <w:bottom w:type="dxa" w:w="60"/>
+              <w:right w:type="dxa" w:w="160"/>
+            </w:tcMar>
+          </w:tcPr>
+          <w:p>
+            <w:r>
+              <w:rPr>
+                <w:rFonts w:ascii="Calibri" w:cs="Calibri" w:eastAsia="Calibri" w:hAnsi="Calibri"/>
+                <w:b/>
+                <w:bCs/>
+                <w:color w:val="1F4E79"/>
+                <w:sz w:val="22"/>
+                <w:szCs w:val="22"/>
+              </w:rPr>
+              <w:t xml:space="preserve">Ambito: </w:t>
+            </w:r>
+            <w:r>
+              <w:rPr>
+                <w:rFonts w:ascii="Calibri" w:cs="Calibri" w:eastAsia="Calibri" w:hAnsi="Calibri"/>
+                <w:i/>
+                <w:iCs/>
+                <w:sz w:val="22"/>
+                <w:szCs w:val="22"/>
+              </w:rPr>
+              <w:t>Network Security &amp; Microsegmentazione (ZTNA, Zero Trust)</w:t>
+            </w:r>
+          </w:p>
+        </w:tc>
+      </w:tr>
+      <w:tr>
+        <w:tc>
+          <w:tcPr>
+            <w:tcW w:type="dxa" w:w="2000"/>
+            <w:tcBorders>
+              <w:top w:val="single" w:color="C9C9C9" w:sz="1"/>
+              <w:left w:val="single" w:color="C9C9C9" w:sz="1"/>
+              <w:bottom w:val="single" w:color="C9C9C9" w:sz="1"/>
+              <w:right w:val="single" w:color="C9C9C9" w:sz="1"/>
+            </w:tcBorders>
+            <w:shd w:fill="2E75B6" w:val="clear"/>
+            <w:tcMar>
+              <w:top w:type="dxa" w:w="80"/>
+              <w:left w:type="dxa" w:w="160"/>
+              <w:bottom w:type="dxa" w:w="80"/>
+              <w:right w:type="dxa" w:w="160"/>
+            </w:tcMar>
+          </w:tcPr>
+          <w:p>
+            <w:r>
+              <w:rPr>
+                <w:rFonts w:ascii="Calibri" w:cs="Calibri" w:eastAsia="Calibri" w:hAnsi="Calibri"/>
+                <w:b/>
+                <w:bCs/>
+                <w:color w:val="FFFFFF"/>
+                <w:sz w:val="20"/>
+                <w:szCs w:val="20"/>
+              </w:rPr>
+              <w:t>Cosa fa</w:t>
+            </w:r>
+          </w:p>
+        </w:tc>
+        <w:tc>
+          <w:tcPr>
+            <w:tcW w:type="dxa" w:w="7026"/>
+            <w:tcBorders>
+              <w:top w:val="single" w:color="C9C9C9" w:sz="1"/>
+              <w:left w:val="single" w:color="C9C9C9" w:sz="1"/>
+              <w:bottom w:val="single" w:color="C9C9C9" w:sz="1"/>
+              <w:right w:val="single" w:color="C9C9C9" w:sz="1"/>
+            </w:tcBorders>
+            <w:tcMar>
+              <w:top w:type="dxa" w:w="80"/>
+              <w:left w:type="dxa" w:w="160"/>
+              <w:bottom w:type="dxa" w:w="80"/>
+              <w:right w:type="dxa" w:w="160"/>
+            </w:tcMar>
+          </w:tcPr>
+          <w:p>
+            <w:r>
+              <w:rPr>
+                <w:rFonts w:ascii="Calibri" w:cs="Calibri" w:eastAsia="Calibri" w:hAnsi="Calibri"/>
+                <w:sz w:val="22"/>
+                <w:szCs w:val="22"/>
+              </w:rPr>
+              <w:t xml:space="preserve">Unica piattaforma che unifica ZTNA + microsegmentazione + MFA adattiva + DNS firewall. Da marzo 2026 con AI policy enforcement: l’AI analizza il comportamento applicativo e genera policy di segmentazione pronte all’enforcement in linguaggio naturale.</w:t>
+            </w:r>
+          </w:p>
+        </w:tc>
+      </w:tr>
+      <w:tr>
+        <w:tc>
+          <w:tcPr>
+            <w:tcW w:type="dxa" w:w="2000"/>
+            <w:tcBorders>
+              <w:top w:val="single" w:color="C9C9C9" w:sz="1"/>
+              <w:left w:val="single" w:color="C9C9C9" w:sz="1"/>
+              <w:bottom w:val="single" w:color="C9C9C9" w:sz="1"/>
+              <w:right w:val="single" w:color="C9C9C9" w:sz="1"/>
+            </w:tcBorders>
+            <w:shd w:fill="2E75B6" w:val="clear"/>
+            <w:tcMar>
+              <w:top w:type="dxa" w:w="80"/>
+              <w:left w:type="dxa" w:w="160"/>
+              <w:bottom w:type="dxa" w:w="80"/>
+              <w:right w:type="dxa" w:w="160"/>
+            </w:tcMar>
+          </w:tcPr>
+          <w:p>
+            <w:r>
+              <w:rPr>
+                <w:rFonts w:ascii="Calibri" w:cs="Calibri" w:eastAsia="Calibri" w:hAnsi="Calibri"/>
+                <w:b/>
+                <w:bCs/>
+                <w:color w:val="FFFFFF"/>
+                <w:sz w:val="20"/>
+                <w:szCs w:val="20"/>
+              </w:rPr>
+              <w:t>Perché ora</w:t>
+            </w:r>
+          </w:p>
+        </w:tc>
+        <w:tc>
+          <w:tcPr>
+            <w:tcW w:type="dxa" w:w="7026"/>
+            <w:tcBorders>
+              <w:top w:val="single" w:color="C9C9C9" w:sz="1"/>
+              <w:left w:val="single" w:color="C9C9C9" w:sz="1"/>
+              <w:bottom w:val="single" w:color="C9C9C9" w:sz="1"/>
+              <w:right w:val="single" w:color="C9C9C9" w:sz="1"/>
+            </w:tcBorders>
+            <w:tcMar>
+              <w:top w:type="dxa" w:w="80"/>
+              <w:left w:type="dxa" w:w="160"/>
+              <w:bottom w:type="dxa" w:w="80"/>
+              <w:right w:type="dxa" w:w="160"/>
+            </w:tcMar>
+          </w:tcPr>
+          <w:p>
+            <w:r>
+              <w:rPr>
+                <w:rFonts w:ascii="Calibri" w:cs="Calibri" w:eastAsia="Calibri" w:hAnsi="Calibri"/>
+                <w:sz w:val="22"/>
+                <w:szCs w:val="22"/>
+              </w:rPr>
+              <w:t xml:space="preserve">Le reti PA italiane sono storicamente piatte. NIS2 (ottobre 2026) impone segmentazione. Guardicore riduce l’implementazione da mesi a giorni tramite AI. Rilevante per enti che migrano al PSN e per compliance ACN su infrastrutture critiche.</w:t>
+            </w:r>
+          </w:p>
+        </w:tc>
+      </w:tr>
+    </w:tbl>
+    <w:p>
+      <w:pPr>
+        <w:spacing w:after="120" w:before="240"/>
+      </w:pPr>
+      <w:r>
+        <w:rPr>
+          <w:rFonts w:ascii="Calibri" w:cs="Calibri" w:eastAsia="Calibri" w:hAnsi="Calibri"/>
+          <w:i/>
+          <w:iCs/>
+          <w:color w:val="595959"/>
+          <w:sz w:val="18"/>
+          <w:szCs w:val="18"/>
+        </w:rPr>
+        <w:t xml:space="preserve">Prossimo briefing: 31 maggio 2026 · Generato automaticamente da Claude · Cowork</w:t>
+      </w:r>
     </w:p>
     <w:p>
       <w:r>

</xml_diff>